<commit_message>
Update Microsoft Word project documentation with recent authentication, async, sitemap, and dataset revisions
</commit_message>
<xml_diff>
--- a/Pakistan_Weather_Analytics_Portal_Documentation.docx
+++ b/Pakistan_Weather_Analytics_Portal_Documentation.docx
@@ -6959,6 +6959,803 @@
       </w:r>
     </w:p>
     <w:p>
+      <w:pPr>
+        <w:keepNext/>
+        <w:spacing w:before="240" w:after="80" w:line="276" w:lineRule="auto"/>
+        <w:jc w:val="left"/>
+      </w:pPr>
+      <w:r>
+        <w:rPr>
+          <w:rFonts w:ascii="Calibri" w:hAnsi="Calibri"/>
+          <w:b/>
+          <w:i w:val="0"/>
+          <w:color w:val="2563EB"/>
+          <w:sz w:val="28"/>
+        </w:rPr>
+        <w:t>4.5 Case-Insensitive Multi-Credential Authentication Backend</w:t>
+      </w:r>
+    </w:p>
+    <w:p>
+      <w:pPr>
+        <w:spacing w:before="0" w:after="120" w:line="276" w:lineRule="auto"/>
+        <w:jc w:val="left"/>
+      </w:pPr>
+      <w:r>
+        <w:rPr>
+          <w:rFonts w:ascii="Calibri" w:hAnsi="Calibri"/>
+          <w:b w:val="0"/>
+          <w:i w:val="0"/>
+          <w:color w:val="334155"/>
+          <w:sz w:val="22"/>
+        </w:rPr>
+        <w:t>To enhance security and user convenience, we implemented a custom authentication backend (CaseInsensitiveAuthBackend). It overrides Django's default model authentication to allow users to log in case-insensitively using either their registered Username or Email address. This completely eliminates authentication failures caused by case mismatches or users entering emails into username fields:</w:t>
+      </w:r>
+    </w:p>
+    <w:p>
+      <w:pPr>
+        <w:spacing w:before="120" w:after="120" w:line="240" w:lineRule="auto"/>
+        <w:ind w:left="576"/>
+        <w:jc w:val="left"/>
+        <w:shd w:fill="F1F5F9"/>
+      </w:pPr>
+      <w:r>
+        <w:rPr>
+          <w:rFonts w:ascii="Consolas" w:hAnsi="Consolas"/>
+          <w:b w:val="0"/>
+          <w:i w:val="0"/>
+          <w:color w:val="1F2937"/>
+          <w:sz w:val="19"/>
+        </w:rPr>
+        <w:t># accounts/backends.py</w:t>
+        <w:br/>
+      </w:r>
+      <w:r>
+        <w:rPr>
+          <w:rFonts w:ascii="Consolas" w:hAnsi="Consolas"/>
+          <w:b w:val="0"/>
+          <w:i w:val="0"/>
+          <w:color w:val="1F2937"/>
+          <w:sz w:val="19"/>
+        </w:rPr>
+        <w:t>from django.contrib.auth.backends import ModelBackend</w:t>
+        <w:br/>
+      </w:r>
+      <w:r>
+        <w:rPr>
+          <w:rFonts w:ascii="Consolas" w:hAnsi="Consolas"/>
+          <w:b w:val="0"/>
+          <w:i w:val="0"/>
+          <w:color w:val="1F2937"/>
+          <w:sz w:val="19"/>
+        </w:rPr>
+        <w:t>from django.contrib.auth.models import User</w:t>
+        <w:br/>
+      </w:r>
+      <w:r>
+        <w:rPr>
+          <w:rFonts w:ascii="Consolas" w:hAnsi="Consolas"/>
+          <w:b w:val="0"/>
+          <w:i w:val="0"/>
+          <w:color w:val="1F2937"/>
+          <w:sz w:val="19"/>
+        </w:rPr>
+        <w:t>from django.db.models import Q</w:t>
+        <w:br/>
+      </w:r>
+      <w:r>
+        <w:rPr>
+          <w:rFonts w:ascii="Consolas" w:hAnsi="Consolas"/>
+          <w:b w:val="0"/>
+          <w:i w:val="0"/>
+          <w:color w:val="1F2937"/>
+          <w:sz w:val="19"/>
+        </w:rPr>
+        <w:br/>
+      </w:r>
+      <w:r>
+        <w:rPr>
+          <w:rFonts w:ascii="Consolas" w:hAnsi="Consolas"/>
+          <w:b w:val="0"/>
+          <w:i w:val="0"/>
+          <w:color w:val="1F2937"/>
+          <w:sz w:val="19"/>
+        </w:rPr>
+        <w:t>class CaseInsensitiveAuthBackend(ModelBackend):</w:t>
+        <w:br/>
+      </w:r>
+      <w:r>
+        <w:rPr>
+          <w:rFonts w:ascii="Consolas" w:hAnsi="Consolas"/>
+          <w:b w:val="0"/>
+          <w:i w:val="0"/>
+          <w:color w:val="1F2937"/>
+          <w:sz w:val="19"/>
+        </w:rPr>
+        <w:t xml:space="preserve">    def authenticate(self, request, username=None, password=None, **kwargs):</w:t>
+        <w:br/>
+      </w:r>
+      <w:r>
+        <w:rPr>
+          <w:rFonts w:ascii="Consolas" w:hAnsi="Consolas"/>
+          <w:b w:val="0"/>
+          <w:i w:val="0"/>
+          <w:color w:val="1F2937"/>
+          <w:sz w:val="19"/>
+        </w:rPr>
+        <w:t xml:space="preserve">        if username is None:</w:t>
+        <w:br/>
+      </w:r>
+      <w:r>
+        <w:rPr>
+          <w:rFonts w:ascii="Consolas" w:hAnsi="Consolas"/>
+          <w:b w:val="0"/>
+          <w:i w:val="0"/>
+          <w:color w:val="1F2937"/>
+          <w:sz w:val="19"/>
+        </w:rPr>
+        <w:t xml:space="preserve">            return None</w:t>
+        <w:br/>
+      </w:r>
+      <w:r>
+        <w:rPr>
+          <w:rFonts w:ascii="Consolas" w:hAnsi="Consolas"/>
+          <w:b w:val="0"/>
+          <w:i w:val="0"/>
+          <w:color w:val="1F2937"/>
+          <w:sz w:val="19"/>
+        </w:rPr>
+        <w:t xml:space="preserve">        try:</w:t>
+        <w:br/>
+      </w:r>
+      <w:r>
+        <w:rPr>
+          <w:rFonts w:ascii="Consolas" w:hAnsi="Consolas"/>
+          <w:b w:val="0"/>
+          <w:i w:val="0"/>
+          <w:color w:val="1F2937"/>
+          <w:sz w:val="19"/>
+        </w:rPr>
+        <w:t xml:space="preserve">            # Case-insensitive lookup for username OR email</w:t>
+        <w:br/>
+      </w:r>
+      <w:r>
+        <w:rPr>
+          <w:rFonts w:ascii="Consolas" w:hAnsi="Consolas"/>
+          <w:b w:val="0"/>
+          <w:i w:val="0"/>
+          <w:color w:val="1F2937"/>
+          <w:sz w:val="19"/>
+        </w:rPr>
+        <w:t xml:space="preserve">            user = User.objects.get(Q(username__iexact=username) | Q(email__iexact=username))</w:t>
+        <w:br/>
+      </w:r>
+      <w:r>
+        <w:rPr>
+          <w:rFonts w:ascii="Consolas" w:hAnsi="Consolas"/>
+          <w:b w:val="0"/>
+          <w:i w:val="0"/>
+          <w:color w:val="1F2937"/>
+          <w:sz w:val="19"/>
+        </w:rPr>
+        <w:t xml:space="preserve">        except User.DoesNotExist:</w:t>
+        <w:br/>
+      </w:r>
+      <w:r>
+        <w:rPr>
+          <w:rFonts w:ascii="Consolas" w:hAnsi="Consolas"/>
+          <w:b w:val="0"/>
+          <w:i w:val="0"/>
+          <w:color w:val="1F2937"/>
+          <w:sz w:val="19"/>
+        </w:rPr>
+        <w:t xml:space="preserve">            return None</w:t>
+        <w:br/>
+      </w:r>
+      <w:r>
+        <w:rPr>
+          <w:rFonts w:ascii="Consolas" w:hAnsi="Consolas"/>
+          <w:b w:val="0"/>
+          <w:i w:val="0"/>
+          <w:color w:val="1F2937"/>
+          <w:sz w:val="19"/>
+        </w:rPr>
+        <w:t xml:space="preserve">        if user.check_password(password) and self.user_can_authenticate(user):</w:t>
+        <w:br/>
+      </w:r>
+      <w:r>
+        <w:rPr>
+          <w:rFonts w:ascii="Consolas" w:hAnsi="Consolas"/>
+          <w:b w:val="0"/>
+          <w:i w:val="0"/>
+          <w:color w:val="1F2937"/>
+          <w:sz w:val="19"/>
+        </w:rPr>
+        <w:t xml:space="preserve">            return user</w:t>
+        <w:br/>
+      </w:r>
+      <w:r>
+        <w:rPr>
+          <w:rFonts w:ascii="Consolas" w:hAnsi="Consolas"/>
+          <w:b w:val="0"/>
+          <w:i w:val="0"/>
+          <w:color w:val="1F2937"/>
+          <w:sz w:val="19"/>
+        </w:rPr>
+        <w:t xml:space="preserve">        return None</w:t>
+        <w:br/>
+      </w:r>
+    </w:p>
+    <w:p>
+      <w:pPr>
+        <w:keepNext/>
+        <w:spacing w:before="240" w:after="80" w:line="276" w:lineRule="auto"/>
+        <w:jc w:val="left"/>
+      </w:pPr>
+      <w:r>
+        <w:rPr>
+          <w:rFonts w:ascii="Calibri" w:hAnsi="Calibri"/>
+          <w:b/>
+          <w:i w:val="0"/>
+          <w:color w:val="2563EB"/>
+          <w:sz w:val="28"/>
+        </w:rPr>
+        <w:t>4.6 Meteorological Health Advisory Widget</w:t>
+      </w:r>
+    </w:p>
+    <w:p>
+      <w:pPr>
+        <w:spacing w:before="0" w:after="120" w:line="276" w:lineRule="auto"/>
+        <w:jc w:val="left"/>
+      </w:pPr>
+      <w:r>
+        <w:rPr>
+          <w:rFonts w:ascii="Calibri" w:hAnsi="Calibri"/>
+          <w:b w:val="0"/>
+          <w:i w:val="0"/>
+          <w:color w:val="334155"/>
+          <w:sz w:val="22"/>
+        </w:rPr>
+        <w:t>An intelligent advisory panel was integrated directly into the user dashboard. It dynamically fetches the current live weather values of the user's first preferred city via client-side API requests and presents contextual health advisories based on threshold values:</w:t>
+      </w:r>
+    </w:p>
+    <w:p>
+      <w:pPr>
+        <w:spacing w:before="0" w:after="60" w:line="276" w:lineRule="auto"/>
+        <w:ind w:left="360" w:hanging="216"/>
+        <w:jc w:val="left"/>
+      </w:pPr>
+      <w:r>
+        <w:rPr>
+          <w:rFonts w:ascii="Calibri" w:hAnsi="Calibri"/>
+          <w:b/>
+          <w:i w:val="0"/>
+          <w:color w:val="2563EB"/>
+          <w:sz w:val="22"/>
+        </w:rPr>
+        <w:t xml:space="preserve">• </w:t>
+      </w:r>
+      <w:r>
+        <w:rPr>
+          <w:rFonts w:ascii="Calibri" w:hAnsi="Calibri"/>
+          <w:b/>
+          <w:i w:val="0"/>
+          <w:color w:val="0F172A"/>
+          <w:sz w:val="22"/>
+        </w:rPr>
+        <w:t xml:space="preserve">Excessive Heat Alert: </w:t>
+      </w:r>
+      <w:r>
+        <w:rPr>
+          <w:rFonts w:ascii="Calibri" w:hAnsi="Calibri"/>
+          <w:b w:val="0"/>
+          <w:i w:val="0"/>
+          <w:color w:val="334155"/>
+          <w:sz w:val="22"/>
+        </w:rPr>
+        <w:t>Activated when temperature exceeds 35C, advising users to maintain hydration and limit direct sun exposure.</w:t>
+      </w:r>
+    </w:p>
+    <w:p>
+      <w:pPr>
+        <w:spacing w:before="0" w:after="60" w:line="276" w:lineRule="auto"/>
+        <w:ind w:left="360" w:hanging="216"/>
+        <w:jc w:val="left"/>
+      </w:pPr>
+      <w:r>
+        <w:rPr>
+          <w:rFonts w:ascii="Calibri" w:hAnsi="Calibri"/>
+          <w:b/>
+          <w:i w:val="0"/>
+          <w:color w:val="2563EB"/>
+          <w:sz w:val="22"/>
+        </w:rPr>
+        <w:t xml:space="preserve">• </w:t>
+      </w:r>
+      <w:r>
+        <w:rPr>
+          <w:rFonts w:ascii="Calibri" w:hAnsi="Calibri"/>
+          <w:b/>
+          <w:i w:val="0"/>
+          <w:color w:val="0F172A"/>
+          <w:sz w:val="22"/>
+        </w:rPr>
+        <w:t xml:space="preserve">Cold Weather Advisory: </w:t>
+      </w:r>
+      <w:r>
+        <w:rPr>
+          <w:rFonts w:ascii="Calibri" w:hAnsi="Calibri"/>
+          <w:b w:val="0"/>
+          <w:i w:val="0"/>
+          <w:color w:val="334155"/>
+          <w:sz w:val="22"/>
+        </w:rPr>
+        <w:t>Activated when temperature drops below 15C, advising warm clothing and proper indoor ventilation.</w:t>
+      </w:r>
+    </w:p>
+    <w:p>
+      <w:pPr>
+        <w:spacing w:before="0" w:after="60" w:line="276" w:lineRule="auto"/>
+        <w:ind w:left="360" w:hanging="216"/>
+        <w:jc w:val="left"/>
+      </w:pPr>
+      <w:r>
+        <w:rPr>
+          <w:rFonts w:ascii="Calibri" w:hAnsi="Calibri"/>
+          <w:b/>
+          <w:i w:val="0"/>
+          <w:color w:val="2563EB"/>
+          <w:sz w:val="22"/>
+        </w:rPr>
+        <w:t xml:space="preserve">• </w:t>
+      </w:r>
+      <w:r>
+        <w:rPr>
+          <w:rFonts w:ascii="Calibri" w:hAnsi="Calibri"/>
+          <w:b/>
+          <w:i w:val="0"/>
+          <w:color w:val="0F172A"/>
+          <w:sz w:val="22"/>
+        </w:rPr>
+        <w:t xml:space="preserve">Rain Advisory: </w:t>
+      </w:r>
+      <w:r>
+        <w:rPr>
+          <w:rFonts w:ascii="Calibri" w:hAnsi="Calibri"/>
+          <w:b w:val="0"/>
+          <w:i w:val="0"/>
+          <w:color w:val="334155"/>
+          <w:sz w:val="22"/>
+        </w:rPr>
+        <w:t>Activated when active precipitation is detected (precipitation &gt; 0.5mm) or condition matches rain, advising travel caution and rain gear.</w:t>
+      </w:r>
+    </w:p>
+    <w:p>
+      <w:pPr>
+        <w:spacing w:before="0" w:after="60" w:line="276" w:lineRule="auto"/>
+        <w:ind w:left="360" w:hanging="216"/>
+        <w:jc w:val="left"/>
+      </w:pPr>
+      <w:r>
+        <w:rPr>
+          <w:rFonts w:ascii="Calibri" w:hAnsi="Calibri"/>
+          <w:b/>
+          <w:i w:val="0"/>
+          <w:color w:val="2563EB"/>
+          <w:sz w:val="22"/>
+        </w:rPr>
+        <w:t xml:space="preserve">• </w:t>
+      </w:r>
+      <w:r>
+        <w:rPr>
+          <w:rFonts w:ascii="Calibri" w:hAnsi="Calibri"/>
+          <w:b/>
+          <w:i w:val="0"/>
+          <w:color w:val="0F172A"/>
+          <w:sz w:val="22"/>
+        </w:rPr>
+        <w:t xml:space="preserve">Optimal Weather: </w:t>
+      </w:r>
+      <w:r>
+        <w:rPr>
+          <w:rFonts w:ascii="Calibri" w:hAnsi="Calibri"/>
+          <w:b w:val="0"/>
+          <w:i w:val="0"/>
+          <w:color w:val="334155"/>
+          <w:sz w:val="22"/>
+        </w:rPr>
+        <w:t>Activated when conditions are pleasant and optimal for outdoor recreational activities.</w:t>
+      </w:r>
+    </w:p>
+    <w:p>
+      <w:pPr>
+        <w:spacing w:before="120" w:after="120" w:line="240" w:lineRule="auto"/>
+        <w:ind w:left="576"/>
+        <w:jc w:val="left"/>
+        <w:shd w:fill="F1F5F9"/>
+      </w:pPr>
+      <w:r>
+        <w:rPr>
+          <w:rFonts w:ascii="Consolas" w:hAnsi="Consolas"/>
+          <w:b w:val="0"/>
+          <w:i w:val="0"/>
+          <w:color w:val="1F2937"/>
+          <w:sz w:val="19"/>
+        </w:rPr>
+        <w:t>// weather/templates/weather/dashboard.html (JavaScript segment)</w:t>
+        <w:br/>
+      </w:r>
+      <w:r>
+        <w:rPr>
+          <w:rFonts w:ascii="Consolas" w:hAnsi="Consolas"/>
+          <w:b w:val="0"/>
+          <w:i w:val="0"/>
+          <w:color w:val="1F2937"/>
+          <w:sz w:val="19"/>
+        </w:rPr>
+        <w:t>async function loadMeteorologicalAdvisory() {</w:t>
+        <w:br/>
+      </w:r>
+      <w:r>
+        <w:rPr>
+          <w:rFonts w:ascii="Consolas" w:hAnsi="Consolas"/>
+          <w:b w:val="0"/>
+          <w:i w:val="0"/>
+          <w:color w:val="1F2937"/>
+          <w:sz w:val="19"/>
+        </w:rPr>
+        <w:t xml:space="preserve">    const cityName = userPreferredCities[0];</w:t>
+        <w:br/>
+      </w:r>
+      <w:r>
+        <w:rPr>
+          <w:rFonts w:ascii="Consolas" w:hAnsi="Consolas"/>
+          <w:b w:val="0"/>
+          <w:i w:val="0"/>
+          <w:color w:val="1F2937"/>
+          <w:sz w:val="19"/>
+        </w:rPr>
+        <w:t xml:space="preserve">    const key = cityName.toLowerCase().trim();</w:t>
+        <w:br/>
+      </w:r>
+      <w:r>
+        <w:rPr>
+          <w:rFonts w:ascii="Consolas" w:hAnsi="Consolas"/>
+          <w:b w:val="0"/>
+          <w:i w:val="0"/>
+          <w:color w:val="1F2937"/>
+          <w:sz w:val="19"/>
+        </w:rPr>
+        <w:t xml:space="preserve">    const cityData = cityCoords[key];</w:t>
+        <w:br/>
+      </w:r>
+      <w:r>
+        <w:rPr>
+          <w:rFonts w:ascii="Consolas" w:hAnsi="Consolas"/>
+          <w:b w:val="0"/>
+          <w:i w:val="0"/>
+          <w:color w:val="1F2937"/>
+          <w:sz w:val="19"/>
+        </w:rPr>
+        <w:t xml:space="preserve">    if (!cityData) return;</w:t>
+        <w:br/>
+      </w:r>
+      <w:r>
+        <w:rPr>
+          <w:rFonts w:ascii="Consolas" w:hAnsi="Consolas"/>
+          <w:b w:val="0"/>
+          <w:i w:val="0"/>
+          <w:color w:val="1F2937"/>
+          <w:sz w:val="19"/>
+        </w:rPr>
+        <w:t xml:space="preserve">    try {</w:t>
+        <w:br/>
+      </w:r>
+      <w:r>
+        <w:rPr>
+          <w:rFonts w:ascii="Consolas" w:hAnsi="Consolas"/>
+          <w:b w:val="0"/>
+          <w:i w:val="0"/>
+          <w:color w:val="1F2937"/>
+          <w:sz w:val="19"/>
+        </w:rPr>
+        <w:t xml:space="preserve">        const url = `https://api.open-meteo.com/v1/forecast?latitude=${cityData.lat}&amp;longitude=${cityData.lon}&amp;current=temperature_2m,precipitation,weather_code`;</w:t>
+        <w:br/>
+      </w:r>
+      <w:r>
+        <w:rPr>
+          <w:rFonts w:ascii="Consolas" w:hAnsi="Consolas"/>
+          <w:b w:val="0"/>
+          <w:i w:val="0"/>
+          <w:color w:val="1F2937"/>
+          <w:sz w:val="19"/>
+        </w:rPr>
+        <w:t xml:space="preserve">        const response = await fetch(url);</w:t>
+        <w:br/>
+      </w:r>
+      <w:r>
+        <w:rPr>
+          <w:rFonts w:ascii="Consolas" w:hAnsi="Consolas"/>
+          <w:b w:val="0"/>
+          <w:i w:val="0"/>
+          <w:color w:val="1F2937"/>
+          <w:sz w:val="19"/>
+        </w:rPr>
+        <w:t xml:space="preserve">        const data = await response.json();</w:t>
+        <w:br/>
+      </w:r>
+      <w:r>
+        <w:rPr>
+          <w:rFonts w:ascii="Consolas" w:hAnsi="Consolas"/>
+          <w:b w:val="0"/>
+          <w:i w:val="0"/>
+          <w:color w:val="1F2937"/>
+          <w:sz w:val="19"/>
+        </w:rPr>
+        <w:t xml:space="preserve">        const current = data.current;</w:t>
+        <w:br/>
+      </w:r>
+      <w:r>
+        <w:rPr>
+          <w:rFonts w:ascii="Consolas" w:hAnsi="Consolas"/>
+          <w:b w:val="0"/>
+          <w:i w:val="0"/>
+          <w:color w:val="1F2937"/>
+          <w:sz w:val="19"/>
+        </w:rPr>
+        <w:t xml:space="preserve">        const mapping = mapWmoCode(current.weather_code);</w:t>
+        <w:br/>
+      </w:r>
+      <w:r>
+        <w:rPr>
+          <w:rFonts w:ascii="Consolas" w:hAnsi="Consolas"/>
+          <w:b w:val="0"/>
+          <w:i w:val="0"/>
+          <w:color w:val="1F2937"/>
+          <w:sz w:val="19"/>
+        </w:rPr>
+        <w:t xml:space="preserve">        updateHealthAdvisory(current.temperature_2m, current.precipitation, mapping.text, cityData.name);</w:t>
+        <w:br/>
+      </w:r>
+      <w:r>
+        <w:rPr>
+          <w:rFonts w:ascii="Consolas" w:hAnsi="Consolas"/>
+          <w:b w:val="0"/>
+          <w:i w:val="0"/>
+          <w:color w:val="1F2937"/>
+          <w:sz w:val="19"/>
+        </w:rPr>
+        <w:t xml:space="preserve">    } catch (err) {</w:t>
+        <w:br/>
+      </w:r>
+      <w:r>
+        <w:rPr>
+          <w:rFonts w:ascii="Consolas" w:hAnsi="Consolas"/>
+          <w:b w:val="0"/>
+          <w:i w:val="0"/>
+          <w:color w:val="1F2937"/>
+          <w:sz w:val="19"/>
+        </w:rPr>
+        <w:t xml:space="preserve">        console.error('Failed to fetch live weather advisory:', err);</w:t>
+        <w:br/>
+      </w:r>
+      <w:r>
+        <w:rPr>
+          <w:rFonts w:ascii="Consolas" w:hAnsi="Consolas"/>
+          <w:b w:val="0"/>
+          <w:i w:val="0"/>
+          <w:color w:val="1F2937"/>
+          <w:sz w:val="19"/>
+        </w:rPr>
+        <w:t xml:space="preserve">    }</w:t>
+        <w:br/>
+      </w:r>
+      <w:r>
+        <w:rPr>
+          <w:rFonts w:ascii="Consolas" w:hAnsi="Consolas"/>
+          <w:b w:val="0"/>
+          <w:i w:val="0"/>
+          <w:color w:val="1F2937"/>
+          <w:sz w:val="19"/>
+        </w:rPr>
+        <w:t>}</w:t>
+        <w:br/>
+      </w:r>
+    </w:p>
+    <w:p>
+      <w:pPr>
+        <w:keepNext/>
+        <w:spacing w:before="240" w:after="80" w:line="276" w:lineRule="auto"/>
+        <w:jc w:val="left"/>
+      </w:pPr>
+      <w:r>
+        <w:rPr>
+          <w:rFonts w:ascii="Calibri" w:hAnsi="Calibri"/>
+          <w:b/>
+          <w:i w:val="0"/>
+          <w:color w:val="2563EB"/>
+          <w:sz w:val="28"/>
+        </w:rPr>
+        <w:t>4.7 Asynchronous Database Synchronization Pipeline</w:t>
+      </w:r>
+    </w:p>
+    <w:p>
+      <w:pPr>
+        <w:spacing w:before="0" w:after="120" w:line="276" w:lineRule="auto"/>
+        <w:jc w:val="left"/>
+      </w:pPr>
+      <w:r>
+        <w:rPr>
+          <w:rFonts w:ascii="Calibri" w:hAnsi="Calibri"/>
+          <w:b w:val="0"/>
+          <w:i w:val="0"/>
+          <w:color w:val="334155"/>
+          <w:sz w:val="22"/>
+        </w:rPr>
+        <w:t>To guarantee high availability and prevent slow external API requests from blocking server processes, database synchronization was refactored to run asynchronously. When a synchronization is required, the application boots a lightweight daemon thread to handle Open-Meteo fetching in the background, allowing views to return immediately to the client browser:</w:t>
+      </w:r>
+    </w:p>
+    <w:p>
+      <w:pPr>
+        <w:spacing w:before="120" w:after="120" w:line="240" w:lineRule="auto"/>
+        <w:ind w:left="576"/>
+        <w:jc w:val="left"/>
+        <w:shd w:fill="F1F5F9"/>
+      </w:pPr>
+      <w:r>
+        <w:rPr>
+          <w:rFonts w:ascii="Consolas" w:hAnsi="Consolas"/>
+          <w:b w:val="0"/>
+          <w:i w:val="0"/>
+          <w:color w:val="1F2937"/>
+          <w:sz w:val="19"/>
+        </w:rPr>
+        <w:t># weather/services.py</w:t>
+        <w:br/>
+      </w:r>
+      <w:r>
+        <w:rPr>
+          <w:rFonts w:ascii="Consolas" w:hAnsi="Consolas"/>
+          <w:b w:val="0"/>
+          <w:i w:val="0"/>
+          <w:color w:val="1F2937"/>
+          <w:sz w:val="19"/>
+        </w:rPr>
+        <w:t>import threading</w:t>
+        <w:br/>
+      </w:r>
+      <w:r>
+        <w:rPr>
+          <w:rFonts w:ascii="Consolas" w:hAnsi="Consolas"/>
+          <w:b w:val="0"/>
+          <w:i w:val="0"/>
+          <w:color w:val="1F2937"/>
+          <w:sz w:val="19"/>
+        </w:rPr>
+        <w:br/>
+      </w:r>
+      <w:r>
+        <w:rPr>
+          <w:rFonts w:ascii="Consolas" w:hAnsi="Consolas"/>
+          <w:b w:val="0"/>
+          <w:i w:val="0"/>
+          <w:color w:val="1F2937"/>
+          <w:sz w:val="19"/>
+        </w:rPr>
+        <w:t>def ensure_weather_data_async():</w:t>
+        <w:br/>
+      </w:r>
+      <w:r>
+        <w:rPr>
+          <w:rFonts w:ascii="Consolas" w:hAnsi="Consolas"/>
+          <w:b w:val="0"/>
+          <w:i w:val="0"/>
+          <w:color w:val="1F2937"/>
+          <w:sz w:val="19"/>
+        </w:rPr>
+        <w:t xml:space="preserve">    """Start weather synchronization in a background thread to prevent blocking web requests."""</w:t>
+        <w:br/>
+      </w:r>
+      <w:r>
+        <w:rPr>
+          <w:rFonts w:ascii="Consolas" w:hAnsi="Consolas"/>
+          <w:b w:val="0"/>
+          <w:i w:val="0"/>
+          <w:color w:val="1F2937"/>
+          <w:sz w:val="19"/>
+        </w:rPr>
+        <w:t xml:space="preserve">    try:</w:t>
+        <w:br/>
+      </w:r>
+      <w:r>
+        <w:rPr>
+          <w:rFonts w:ascii="Consolas" w:hAnsi="Consolas"/>
+          <w:b w:val="0"/>
+          <w:i w:val="0"/>
+          <w:color w:val="1F2937"/>
+          <w:sz w:val="19"/>
+        </w:rPr>
+        <w:t xml:space="preserve">        should_sync, days = needs_weather_sync()</w:t>
+        <w:br/>
+      </w:r>
+      <w:r>
+        <w:rPr>
+          <w:rFonts w:ascii="Consolas" w:hAnsi="Consolas"/>
+          <w:b w:val="0"/>
+          <w:i w:val="0"/>
+          <w:color w:val="1F2937"/>
+          <w:sz w:val="19"/>
+        </w:rPr>
+        <w:t xml:space="preserve">        if should_sync:</w:t>
+        <w:br/>
+      </w:r>
+      <w:r>
+        <w:rPr>
+          <w:rFonts w:ascii="Consolas" w:hAnsi="Consolas"/>
+          <w:b w:val="0"/>
+          <w:i w:val="0"/>
+          <w:color w:val="1F2937"/>
+          <w:sz w:val="19"/>
+        </w:rPr>
+        <w:t xml:space="preserve">            thread = threading.Thread(target=sync_weather_data, kwargs={'days': days})</w:t>
+        <w:br/>
+      </w:r>
+      <w:r>
+        <w:rPr>
+          <w:rFonts w:ascii="Consolas" w:hAnsi="Consolas"/>
+          <w:b w:val="0"/>
+          <w:i w:val="0"/>
+          <w:color w:val="1F2937"/>
+          <w:sz w:val="19"/>
+        </w:rPr>
+        <w:t xml:space="preserve">            thread.daemon = True</w:t>
+        <w:br/>
+      </w:r>
+      <w:r>
+        <w:rPr>
+          <w:rFonts w:ascii="Consolas" w:hAnsi="Consolas"/>
+          <w:b w:val="0"/>
+          <w:i w:val="0"/>
+          <w:color w:val="1F2937"/>
+          <w:sz w:val="19"/>
+        </w:rPr>
+        <w:t xml:space="preserve">            thread.start()</w:t>
+        <w:br/>
+      </w:r>
+      <w:r>
+        <w:rPr>
+          <w:rFonts w:ascii="Consolas" w:hAnsi="Consolas"/>
+          <w:b w:val="0"/>
+          <w:i w:val="0"/>
+          <w:color w:val="1F2937"/>
+          <w:sz w:val="19"/>
+        </w:rPr>
+        <w:t xml:space="preserve">            logger.info('Started background weather sync thread for %d days', days)</w:t>
+        <w:br/>
+      </w:r>
+      <w:r>
+        <w:rPr>
+          <w:rFonts w:ascii="Consolas" w:hAnsi="Consolas"/>
+          <w:b w:val="0"/>
+          <w:i w:val="0"/>
+          <w:color w:val="1F2937"/>
+          <w:sz w:val="19"/>
+        </w:rPr>
+        <w:t xml:space="preserve">    except Exception:</w:t>
+        <w:br/>
+      </w:r>
+      <w:r>
+        <w:rPr>
+          <w:rFonts w:ascii="Consolas" w:hAnsi="Consolas"/>
+          <w:b w:val="0"/>
+          <w:i w:val="0"/>
+          <w:color w:val="1F2937"/>
+          <w:sz w:val="19"/>
+        </w:rPr>
+        <w:t xml:space="preserve">        logger.exception('Failed to start background weather sync thread')</w:t>
+        <w:br/>
+      </w:r>
+    </w:p>
+    <w:p>
       <w:r>
         <w:br w:type="page"/>
       </w:r>
@@ -8484,7 +9281,404 @@
           <w:color w:val="334155"/>
           <w:sz w:val="22"/>
         </w:rPr>
-        <w:t>A sample dataset is provided as a seed file under data/weather_data_seed.csv. It represents over 1,000 observations of daily weather data for 12 major cities in Pakistan (Lahore, Karachi, Islamabad, Peshawar, Rawalpindi, Faisalabad, Multan, Quetta, Sialkot, Gujranwala, Hyderabad, Bahawalpur). It includes variables such as Temp Max, Temp Min, Avg Temp, Humidity %, Precipitation mm, Wind speed km/h, Wind direction, Pressure hPa, and Weather Condition tags.</w:t>
+        <w:t>The historical and real-time weather analytics database is seeded and synchronized dynamically using the Open-Meteo Historical Weather API. Open-Meteo provides free, open-source access to historical weather databases derived from high-resolution meteorological models, specifically the Copernicus ERA5 and ERA5-Land reanalysis datasets managed by the European Centre for Medium-Range Weather Forecasts (ECMWF).</w:t>
+      </w:r>
+    </w:p>
+    <w:p>
+      <w:pPr>
+        <w:spacing w:before="0" w:after="120" w:line="276" w:lineRule="auto"/>
+        <w:jc w:val="left"/>
+      </w:pPr>
+      <w:r>
+        <w:rPr>
+          <w:rFonts w:ascii="Calibri" w:hAnsi="Calibri"/>
+          <w:b w:val="0"/>
+          <w:i w:val="0"/>
+          <w:color w:val="334155"/>
+          <w:sz w:val="22"/>
+        </w:rPr>
+        <w:t>The dataset covers hourly and daily aggregates dating back to 1940. For this project, we fetch and index daily climate variables for 12 major cities in Pakistan (Lahore, Karachi, Islamabad, Peshawar, Rawalpindi, Faisalabad, Multan, Quetta, Sialkot, Gujranwala, Hyderabad, and Bahawalpur). The synced parameters include:</w:t>
+      </w:r>
+    </w:p>
+    <w:p>
+      <w:pPr>
+        <w:spacing w:before="0" w:after="60" w:line="276" w:lineRule="auto"/>
+        <w:ind w:left="360" w:hanging="216"/>
+        <w:jc w:val="left"/>
+      </w:pPr>
+      <w:r>
+        <w:rPr>
+          <w:rFonts w:ascii="Calibri" w:hAnsi="Calibri"/>
+          <w:b/>
+          <w:i w:val="0"/>
+          <w:color w:val="2563EB"/>
+          <w:sz w:val="22"/>
+        </w:rPr>
+        <w:t xml:space="preserve">• </w:t>
+      </w:r>
+      <w:r>
+        <w:rPr>
+          <w:rFonts w:ascii="Calibri" w:hAnsi="Calibri"/>
+          <w:b/>
+          <w:i w:val="0"/>
+          <w:color w:val="0F172A"/>
+          <w:sz w:val="22"/>
+        </w:rPr>
+        <w:t xml:space="preserve">temperature_2m_max (C): </w:t>
+      </w:r>
+      <w:r>
+        <w:rPr>
+          <w:rFonts w:ascii="Calibri" w:hAnsi="Calibri"/>
+          <w:b w:val="0"/>
+          <w:i w:val="0"/>
+          <w:color w:val="334155"/>
+          <w:sz w:val="22"/>
+        </w:rPr>
+        <w:t>Maximum temperature at 2 meters above ground level.</w:t>
+      </w:r>
+    </w:p>
+    <w:p>
+      <w:pPr>
+        <w:spacing w:before="0" w:after="60" w:line="276" w:lineRule="auto"/>
+        <w:ind w:left="360" w:hanging="216"/>
+        <w:jc w:val="left"/>
+      </w:pPr>
+      <w:r>
+        <w:rPr>
+          <w:rFonts w:ascii="Calibri" w:hAnsi="Calibri"/>
+          <w:b/>
+          <w:i w:val="0"/>
+          <w:color w:val="2563EB"/>
+          <w:sz w:val="22"/>
+        </w:rPr>
+        <w:t xml:space="preserve">• </w:t>
+      </w:r>
+      <w:r>
+        <w:rPr>
+          <w:rFonts w:ascii="Calibri" w:hAnsi="Calibri"/>
+          <w:b/>
+          <w:i w:val="0"/>
+          <w:color w:val="0F172A"/>
+          <w:sz w:val="22"/>
+        </w:rPr>
+        <w:t xml:space="preserve">temperature_2m_min (C): </w:t>
+      </w:r>
+      <w:r>
+        <w:rPr>
+          <w:rFonts w:ascii="Calibri" w:hAnsi="Calibri"/>
+          <w:b w:val="0"/>
+          <w:i w:val="0"/>
+          <w:color w:val="334155"/>
+          <w:sz w:val="22"/>
+        </w:rPr>
+        <w:t>Minimum temperature at 2 meters above ground level.</w:t>
+      </w:r>
+    </w:p>
+    <w:p>
+      <w:pPr>
+        <w:spacing w:before="0" w:after="60" w:line="276" w:lineRule="auto"/>
+        <w:ind w:left="360" w:hanging="216"/>
+        <w:jc w:val="left"/>
+      </w:pPr>
+      <w:r>
+        <w:rPr>
+          <w:rFonts w:ascii="Calibri" w:hAnsi="Calibri"/>
+          <w:b/>
+          <w:i w:val="0"/>
+          <w:color w:val="2563EB"/>
+          <w:sz w:val="22"/>
+        </w:rPr>
+        <w:t xml:space="preserve">• </w:t>
+      </w:r>
+      <w:r>
+        <w:rPr>
+          <w:rFonts w:ascii="Calibri" w:hAnsi="Calibri"/>
+          <w:b/>
+          <w:i w:val="0"/>
+          <w:color w:val="0F172A"/>
+          <w:sz w:val="22"/>
+        </w:rPr>
+        <w:t xml:space="preserve">temperature_2m_mean (C): </w:t>
+      </w:r>
+      <w:r>
+        <w:rPr>
+          <w:rFonts w:ascii="Calibri" w:hAnsi="Calibri"/>
+          <w:b w:val="0"/>
+          <w:i w:val="0"/>
+          <w:color w:val="334155"/>
+          <w:sz w:val="22"/>
+        </w:rPr>
+        <w:t>Average/Mean daily temperature.</w:t>
+      </w:r>
+    </w:p>
+    <w:p>
+      <w:pPr>
+        <w:spacing w:before="0" w:after="60" w:line="276" w:lineRule="auto"/>
+        <w:ind w:left="360" w:hanging="216"/>
+        <w:jc w:val="left"/>
+      </w:pPr>
+      <w:r>
+        <w:rPr>
+          <w:rFonts w:ascii="Calibri" w:hAnsi="Calibri"/>
+          <w:b/>
+          <w:i w:val="0"/>
+          <w:color w:val="2563EB"/>
+          <w:sz w:val="22"/>
+        </w:rPr>
+        <w:t xml:space="preserve">• </w:t>
+      </w:r>
+      <w:r>
+        <w:rPr>
+          <w:rFonts w:ascii="Calibri" w:hAnsi="Calibri"/>
+          <w:b/>
+          <w:i w:val="0"/>
+          <w:color w:val="0F172A"/>
+          <w:sz w:val="22"/>
+        </w:rPr>
+        <w:t xml:space="preserve">relative_humidity_2m_mean (%): </w:t>
+      </w:r>
+      <w:r>
+        <w:rPr>
+          <w:rFonts w:ascii="Calibri" w:hAnsi="Calibri"/>
+          <w:b w:val="0"/>
+          <w:i w:val="0"/>
+          <w:color w:val="334155"/>
+          <w:sz w:val="22"/>
+        </w:rPr>
+        <w:t>Mean relative humidity percentage.</w:t>
+      </w:r>
+    </w:p>
+    <w:p>
+      <w:pPr>
+        <w:spacing w:before="0" w:after="60" w:line="276" w:lineRule="auto"/>
+        <w:ind w:left="360" w:hanging="216"/>
+        <w:jc w:val="left"/>
+      </w:pPr>
+      <w:r>
+        <w:rPr>
+          <w:rFonts w:ascii="Calibri" w:hAnsi="Calibri"/>
+          <w:b/>
+          <w:i w:val="0"/>
+          <w:color w:val="2563EB"/>
+          <w:sz w:val="22"/>
+        </w:rPr>
+        <w:t xml:space="preserve">• </w:t>
+      </w:r>
+      <w:r>
+        <w:rPr>
+          <w:rFonts w:ascii="Calibri" w:hAnsi="Calibri"/>
+          <w:b/>
+          <w:i w:val="0"/>
+          <w:color w:val="0F172A"/>
+          <w:sz w:val="22"/>
+        </w:rPr>
+        <w:t xml:space="preserve">precipitation_sum (mm): </w:t>
+      </w:r>
+      <w:r>
+        <w:rPr>
+          <w:rFonts w:ascii="Calibri" w:hAnsi="Calibri"/>
+          <w:b w:val="0"/>
+          <w:i w:val="0"/>
+          <w:color w:val="334155"/>
+          <w:sz w:val="22"/>
+        </w:rPr>
+        <w:t>Total daily rain and snowfall volume.</w:t>
+      </w:r>
+    </w:p>
+    <w:p>
+      <w:pPr>
+        <w:spacing w:before="0" w:after="60" w:line="276" w:lineRule="auto"/>
+        <w:ind w:left="360" w:hanging="216"/>
+        <w:jc w:val="left"/>
+      </w:pPr>
+      <w:r>
+        <w:rPr>
+          <w:rFonts w:ascii="Calibri" w:hAnsi="Calibri"/>
+          <w:b/>
+          <w:i w:val="0"/>
+          <w:color w:val="2563EB"/>
+          <w:sz w:val="22"/>
+        </w:rPr>
+        <w:t xml:space="preserve">• </w:t>
+      </w:r>
+      <w:r>
+        <w:rPr>
+          <w:rFonts w:ascii="Calibri" w:hAnsi="Calibri"/>
+          <w:b/>
+          <w:i w:val="0"/>
+          <w:color w:val="0F172A"/>
+          <w:sz w:val="22"/>
+        </w:rPr>
+        <w:t xml:space="preserve">wind_speed_10m_max (km/h): </w:t>
+      </w:r>
+      <w:r>
+        <w:rPr>
+          <w:rFonts w:ascii="Calibri" w:hAnsi="Calibri"/>
+          <w:b w:val="0"/>
+          <w:i w:val="0"/>
+          <w:color w:val="334155"/>
+          <w:sz w:val="22"/>
+        </w:rPr>
+        <w:t>Maximum daily wind gust speed.</w:t>
+      </w:r>
+    </w:p>
+    <w:p>
+      <w:pPr>
+        <w:spacing w:before="0" w:after="60" w:line="276" w:lineRule="auto"/>
+        <w:ind w:left="360" w:hanging="216"/>
+        <w:jc w:val="left"/>
+      </w:pPr>
+      <w:r>
+        <w:rPr>
+          <w:rFonts w:ascii="Calibri" w:hAnsi="Calibri"/>
+          <w:b/>
+          <w:i w:val="0"/>
+          <w:color w:val="2563EB"/>
+          <w:sz w:val="22"/>
+        </w:rPr>
+        <w:t xml:space="preserve">• </w:t>
+      </w:r>
+      <w:r>
+        <w:rPr>
+          <w:rFonts w:ascii="Calibri" w:hAnsi="Calibri"/>
+          <w:b/>
+          <w:i w:val="0"/>
+          <w:color w:val="0F172A"/>
+          <w:sz w:val="22"/>
+        </w:rPr>
+        <w:t xml:space="preserve">wind_direction_10m_dominant: </w:t>
+      </w:r>
+      <w:r>
+        <w:rPr>
+          <w:rFonts w:ascii="Calibri" w:hAnsi="Calibri"/>
+          <w:b w:val="0"/>
+          <w:i w:val="0"/>
+          <w:color w:val="334155"/>
+          <w:sz w:val="22"/>
+        </w:rPr>
+        <w:t>Dominant wind direction degrees mapped to compass bearings (e.g., N, SW, NE).</w:t>
+      </w:r>
+    </w:p>
+    <w:p>
+      <w:pPr>
+        <w:spacing w:before="0" w:after="60" w:line="276" w:lineRule="auto"/>
+        <w:ind w:left="360" w:hanging="216"/>
+        <w:jc w:val="left"/>
+      </w:pPr>
+      <w:r>
+        <w:rPr>
+          <w:rFonts w:ascii="Calibri" w:hAnsi="Calibri"/>
+          <w:b/>
+          <w:i w:val="0"/>
+          <w:color w:val="2563EB"/>
+          <w:sz w:val="22"/>
+        </w:rPr>
+        <w:t xml:space="preserve">• </w:t>
+      </w:r>
+      <w:r>
+        <w:rPr>
+          <w:rFonts w:ascii="Calibri" w:hAnsi="Calibri"/>
+          <w:b/>
+          <w:i w:val="0"/>
+          <w:color w:val="0F172A"/>
+          <w:sz w:val="22"/>
+        </w:rPr>
+        <w:t xml:space="preserve">surface_pressure_mean (hPa): </w:t>
+      </w:r>
+      <w:r>
+        <w:rPr>
+          <w:rFonts w:ascii="Calibri" w:hAnsi="Calibri"/>
+          <w:b w:val="0"/>
+          <w:i w:val="0"/>
+          <w:color w:val="334155"/>
+          <w:sz w:val="22"/>
+        </w:rPr>
+        <w:t>Mean surface level atmospheric pressure.</w:t>
+      </w:r>
+    </w:p>
+    <w:p>
+      <w:pPr>
+        <w:spacing w:before="0" w:after="60" w:line="276" w:lineRule="auto"/>
+        <w:ind w:left="360" w:hanging="216"/>
+        <w:jc w:val="left"/>
+      </w:pPr>
+      <w:r>
+        <w:rPr>
+          <w:rFonts w:ascii="Calibri" w:hAnsi="Calibri"/>
+          <w:b/>
+          <w:i w:val="0"/>
+          <w:color w:val="2563EB"/>
+          <w:sz w:val="22"/>
+        </w:rPr>
+        <w:t xml:space="preserve">• </w:t>
+      </w:r>
+      <w:r>
+        <w:rPr>
+          <w:rFonts w:ascii="Calibri" w:hAnsi="Calibri"/>
+          <w:b/>
+          <w:i w:val="0"/>
+          <w:color w:val="0F172A"/>
+          <w:sz w:val="22"/>
+        </w:rPr>
+        <w:t xml:space="preserve">weather_code: </w:t>
+      </w:r>
+      <w:r>
+        <w:rPr>
+          <w:rFonts w:ascii="Calibri" w:hAnsi="Calibri"/>
+          <w:b w:val="0"/>
+          <w:i w:val="0"/>
+          <w:color w:val="334155"/>
+          <w:sz w:val="22"/>
+        </w:rPr>
+        <w:t>World Meteorological Organization (WMO) weather code mapping to conditions (e.g., Sunny, Fog, Rain, Thunderstorm).</w:t>
+      </w:r>
+    </w:p>
+    <w:p>
+      <w:pPr>
+        <w:spacing w:before="0" w:after="120" w:line="276" w:lineRule="auto"/>
+        <w:jc w:val="left"/>
+      </w:pPr>
+      <w:r>
+        <w:rPr>
+          <w:rFonts w:ascii="Calibri" w:hAnsi="Calibri"/>
+          <w:b w:val="0"/>
+          <w:i w:val="0"/>
+          <w:color w:val="334155"/>
+          <w:sz w:val="22"/>
+        </w:rPr>
+        <w:t xml:space="preserve">Official Dataset Source &amp; API Documentation Link: </w:t>
+      </w:r>
+    </w:p>
+    <w:p>
+      <w:pPr>
+        <w:spacing w:before="0" w:after="120" w:line="276" w:lineRule="auto"/>
+        <w:jc w:val="left"/>
+      </w:pPr>
+      <w:r>
+        <w:rPr>
+          <w:rFonts w:ascii="Calibri" w:hAnsi="Calibri"/>
+          <w:b/>
+          <w:i w:val="0"/>
+          <w:color w:val="2563EB"/>
+          <w:sz w:val="21"/>
+        </w:rPr>
+        <w:t>https://open-meteo.com/en/docs/historical-weather-api</w:t>
+      </w:r>
+    </w:p>
+    <w:p>
+      <w:pPr>
+        <w:spacing w:before="0" w:after="120" w:line="276" w:lineRule="auto"/>
+        <w:jc w:val="left"/>
+      </w:pPr>
+      <w:r>
+        <w:rPr>
+          <w:rFonts w:ascii="Calibri" w:hAnsi="Calibri"/>
+          <w:b w:val="0"/>
+          <w:i w:val="0"/>
+          <w:color w:val="334155"/>
+          <w:sz w:val="22"/>
+        </w:rPr>
+        <w:t>A localized static subset of this dataset is also included in the repository seed file at data/sample_weather_data.csv for development, staging, and grading purposes.</w:t>
       </w:r>
     </w:p>
     <w:p>
@@ -9155,7 +10349,7 @@
           <w:color w:val="2563EB"/>
           <w:sz w:val="21"/>
         </w:rPr>
-        <w:t>https://pakweatheranalytics.onrender.com/</w:t>
+        <w:t>https://pakweatheranalytics-production.up.railway.app/</w:t>
         <w:br/>
       </w:r>
       <w:r>

</xml_diff>